<commit_message>
Update Respostas do desafio técnico.docx
inclusão do link Github
</commit_message>
<xml_diff>
--- a/Respostas do desafio técnico.docx
+++ b/Respostas do desafio técnico.docx
@@ -293,15 +293,7 @@
       </w:r>
       <w:proofErr w:type="spellEnd"/>
       <w:r>
-        <w:t xml:space="preserve"> </w:t>
-      </w:r>
-      <w:proofErr w:type="gramStart"/>
-      <w:r>
-        <w:t>425 conjunto</w:t>
-      </w:r>
-      <w:proofErr w:type="gramEnd"/>
-      <w:r>
-        <w:t xml:space="preserve"> 02”.</w:t>
+        <w:t xml:space="preserve"> 425 conjunto 02”.</w:t>
       </w:r>
     </w:p>
     <w:p>
@@ -513,13 +505,7 @@
         </w:numPr>
       </w:pPr>
       <w:r>
-        <w:t>CT0</w:t>
-      </w:r>
-      <w:r>
-        <w:t>3</w:t>
-      </w:r>
-      <w:r>
-        <w:t xml:space="preserve"> – F</w:t>
+        <w:t>CT03 – F</w:t>
       </w:r>
       <w:r>
         <w:t>A</w:t>
@@ -1009,6 +995,14 @@
       <w:r>
         <w:t>Link da estrutura produzida</w:t>
       </w:r>
+      <w:r>
+        <w:t xml:space="preserve"> </w:t>
+      </w:r>
+      <w:proofErr w:type="spellStart"/>
+      <w:r>
+        <w:t>Postman</w:t>
+      </w:r>
+      <w:proofErr w:type="spellEnd"/>
     </w:p>
     <w:p>
       <w:hyperlink r:id="rId5" w:history="1">
@@ -1020,6 +1014,32 @@
         </w:r>
       </w:hyperlink>
     </w:p>
+    <w:p>
+      <w:pPr>
+        <w:pStyle w:val="PargrafodaLista"/>
+        <w:ind w:left="0"/>
+      </w:pPr>
+      <w:r>
+        <w:t xml:space="preserve">Link da estrutura produzida </w:t>
+      </w:r>
+      <w:r>
+        <w:t>G</w:t>
+      </w:r>
+      <w:r>
+        <w:t>ithub</w:t>
+      </w:r>
+    </w:p>
+    <w:p>
+      <w:hyperlink r:id="rId6" w:history="1">
+        <w:r>
+          <w:rPr>
+            <w:rStyle w:val="Hyperlink"/>
+          </w:rPr>
+          <w:t>https://github.com/mffernandes1991/DesafioTecnico.git</w:t>
+        </w:r>
+      </w:hyperlink>
+    </w:p>
+    <w:p/>
     <w:p/>
     <w:p>
       <w:pPr>
@@ -1129,6 +1149,7 @@
         <w:rPr>
           <w:b/>
           <w:bCs/>
+          <w:noProof/>
         </w:rPr>
         <w:drawing>
           <wp:inline distT="0" distB="0" distL="0" distR="0" wp14:anchorId="1AE19FDB" wp14:editId="6DD0F6DD">
@@ -1146,7 +1167,7 @@
                     <pic:cNvPicPr/>
                   </pic:nvPicPr>
                   <pic:blipFill>
-                    <a:blip r:embed="rId6"/>
+                    <a:blip r:embed="rId7"/>
                     <a:stretch>
                       <a:fillRect/>
                     </a:stretch>
@@ -1279,27 +1300,22 @@
       </w:r>
       <w:proofErr w:type="spellEnd"/>
       <w:r>
-        <w:t xml:space="preserve"> </w:t>
-      </w:r>
-      <w:proofErr w:type="gramStart"/>
-      <w:r>
-        <w:t>425 conjunto</w:t>
-      </w:r>
-      <w:proofErr w:type="gramEnd"/>
-      <w:r>
-        <w:t xml:space="preserve"> 02”.</w:t>
-      </w:r>
-    </w:p>
-    <w:p>
-      <w:pPr>
-        <w:pStyle w:val="PargrafodaLista"/>
-      </w:pPr>
-    </w:p>
-    <w:p>
-      <w:pPr>
-        <w:pStyle w:val="PargrafodaLista"/>
-      </w:pPr>
-      <w:r>
+        <w:t xml:space="preserve"> 425 conjunto 02”.</w:t>
+      </w:r>
+    </w:p>
+    <w:p>
+      <w:pPr>
+        <w:pStyle w:val="PargrafodaLista"/>
+      </w:pPr>
+    </w:p>
+    <w:p>
+      <w:pPr>
+        <w:pStyle w:val="PargrafodaLista"/>
+      </w:pPr>
+      <w:r>
+        <w:rPr>
+          <w:noProof/>
+        </w:rPr>
         <w:lastRenderedPageBreak/>
         <w:drawing>
           <wp:inline distT="0" distB="0" distL="0" distR="0" wp14:anchorId="1FBB73B2" wp14:editId="60A41113">
@@ -1314,152 +1330,6 @@
                 <pic:pic xmlns:pic="http://schemas.openxmlformats.org/drawingml/2006/picture">
                   <pic:nvPicPr>
                     <pic:cNvPr id="12324847" name=""/>
-                    <pic:cNvPicPr/>
-                  </pic:nvPicPr>
-                  <pic:blipFill>
-                    <a:blip r:embed="rId7"/>
-                    <a:stretch>
-                      <a:fillRect/>
-                    </a:stretch>
-                  </pic:blipFill>
-                  <pic:spPr>
-                    <a:xfrm>
-                      <a:off x="0" y="0"/>
-                      <a:ext cx="5400040" cy="2817495"/>
-                    </a:xfrm>
-                    <a:prstGeom prst="rect">
-                      <a:avLst/>
-                    </a:prstGeom>
-                  </pic:spPr>
-                </pic:pic>
-              </a:graphicData>
-            </a:graphic>
-          </wp:inline>
-        </w:drawing>
-      </w:r>
-    </w:p>
-    <w:p>
-      <w:pPr>
-        <w:rPr>
-          <w:b/>
-          <w:bCs/>
-        </w:rPr>
-      </w:pPr>
-    </w:p>
-    <w:p>
-      <w:pPr>
-        <w:rPr>
-          <w:b/>
-          <w:bCs/>
-        </w:rPr>
-      </w:pPr>
-    </w:p>
-    <w:p>
-      <w:pPr>
-        <w:pStyle w:val="PargrafodaLista"/>
-        <w:numPr>
-          <w:ilvl w:val="0"/>
-          <w:numId w:val="5"/>
-        </w:numPr>
-      </w:pPr>
-      <w:r>
-        <w:t>CT02 – FB – C</w:t>
-      </w:r>
-      <w:r>
-        <w:t xml:space="preserve">ampos obrigatórios </w:t>
-      </w:r>
-    </w:p>
-    <w:p>
-      <w:pPr>
-        <w:pStyle w:val="PargrafodaLista"/>
-        <w:rPr>
-          <w:sz w:val="6"/>
-          <w:szCs w:val="6"/>
-        </w:rPr>
-      </w:pPr>
-    </w:p>
-    <w:p>
-      <w:pPr>
-        <w:pStyle w:val="PargrafodaLista"/>
-      </w:pPr>
-      <w:r>
-        <w:rPr>
-          <w:b/>
-          <w:bCs/>
-        </w:rPr>
-        <w:t>Dado</w:t>
-      </w:r>
-      <w:r>
-        <w:t xml:space="preserve"> que eu realizo a busca de um </w:t>
-      </w:r>
-      <w:r>
-        <w:t>CEP válido</w:t>
-      </w:r>
-    </w:p>
-    <w:p>
-      <w:pPr>
-        <w:pStyle w:val="PargrafodaLista"/>
-      </w:pPr>
-      <w:r>
-        <w:rPr>
-          <w:b/>
-          <w:bCs/>
-        </w:rPr>
-        <w:t>Quando</w:t>
-      </w:r>
-      <w:r>
-        <w:t xml:space="preserve"> </w:t>
-      </w:r>
-      <w:r>
-        <w:t>realiz</w:t>
-      </w:r>
-      <w:r>
-        <w:t>o</w:t>
-      </w:r>
-      <w:r>
-        <w:t xml:space="preserve"> uma requisição</w:t>
-      </w:r>
-      <w:r>
-        <w:t xml:space="preserve"> (</w:t>
-      </w:r>
-      <w:r>
-        <w:t>https://cdn.apicep.com/file/</w:t>
-      </w:r>
-      <w:proofErr w:type="spellStart"/>
-      <w:r>
-        <w:t>apicep</w:t>
-      </w:r>
-      <w:proofErr w:type="spellEnd"/>
-      <w:r>
-        <w:t>/06233-030.json</w:t>
-      </w:r>
-      <w:r>
-        <w:t>)</w:t>
-      </w:r>
-    </w:p>
-    <w:p>
-      <w:pPr>
-        <w:pStyle w:val="PargrafodaLista"/>
-      </w:pPr>
-    </w:p>
-    <w:p>
-      <w:pPr>
-        <w:pStyle w:val="PargrafodaLista"/>
-      </w:pPr>
-      <w:r>
-        <w:drawing>
-          <wp:inline distT="0" distB="0" distL="0" distR="0" wp14:anchorId="0440ED10" wp14:editId="473F60AD">
-            <wp:extent cx="5400040" cy="2817495"/>
-            <wp:effectExtent l="0" t="0" r="0" b="1905"/>
-            <wp:docPr id="1096123355" name="Imagem 1"/>
-            <wp:cNvGraphicFramePr>
-              <a:graphicFrameLocks xmlns:a="http://schemas.openxmlformats.org/drawingml/2006/main" noChangeAspect="1"/>
-            </wp:cNvGraphicFramePr>
-            <a:graphic xmlns:a="http://schemas.openxmlformats.org/drawingml/2006/main">
-              <a:graphicData uri="http://schemas.openxmlformats.org/drawingml/2006/picture">
-                <pic:pic xmlns:pic="http://schemas.openxmlformats.org/drawingml/2006/picture">
-                  <pic:nvPicPr>
-                    <pic:cNvPr id="1096123355" name=""/>
                     <pic:cNvPicPr/>
                   </pic:nvPicPr>
                   <pic:blipFill>
@@ -1486,127 +1356,121 @@
     </w:p>
     <w:p>
       <w:pPr>
-        <w:pStyle w:val="PargrafodaLista"/>
-      </w:pPr>
-    </w:p>
-    <w:p>
-      <w:pPr>
-        <w:pStyle w:val="PargrafodaLista"/>
-      </w:pPr>
-      <w:r>
-        <w:rPr>
-          <w:b/>
-          <w:bCs/>
-        </w:rPr>
-        <w:t xml:space="preserve">Então </w:t>
-      </w:r>
-      <w:r>
-        <w:t xml:space="preserve">o JSON de retorno deve conter obrigatoriamente os campos </w:t>
-      </w:r>
-    </w:p>
-    <w:p>
-      <w:pPr>
-        <w:pStyle w:val="PargrafodaLista"/>
-      </w:pPr>
-      <w:r>
-        <w:t>{"status":200,</w:t>
-      </w:r>
-    </w:p>
-    <w:p>
-      <w:pPr>
-        <w:pStyle w:val="PargrafodaLista"/>
-      </w:pPr>
-      <w:r>
-        <w:t> "code":"06233-030",</w:t>
-      </w:r>
-    </w:p>
-    <w:p>
-      <w:pPr>
-        <w:pStyle w:val="PargrafodaLista"/>
-      </w:pPr>
-      <w:r>
-        <w:t> "</w:t>
+        <w:rPr>
+          <w:b/>
+          <w:bCs/>
+        </w:rPr>
+      </w:pPr>
+    </w:p>
+    <w:p>
+      <w:pPr>
+        <w:rPr>
+          <w:b/>
+          <w:bCs/>
+        </w:rPr>
+      </w:pPr>
+    </w:p>
+    <w:p>
+      <w:pPr>
+        <w:pStyle w:val="PargrafodaLista"/>
+        <w:numPr>
+          <w:ilvl w:val="0"/>
+          <w:numId w:val="5"/>
+        </w:numPr>
+      </w:pPr>
+      <w:r>
+        <w:t>CT02 – FB – C</w:t>
+      </w:r>
+      <w:r>
+        <w:t xml:space="preserve">ampos obrigatórios </w:t>
+      </w:r>
+    </w:p>
+    <w:p>
+      <w:pPr>
+        <w:pStyle w:val="PargrafodaLista"/>
+        <w:rPr>
+          <w:sz w:val="6"/>
+          <w:szCs w:val="6"/>
+        </w:rPr>
+      </w:pPr>
+    </w:p>
+    <w:p>
+      <w:pPr>
+        <w:pStyle w:val="PargrafodaLista"/>
+      </w:pPr>
+      <w:r>
+        <w:rPr>
+          <w:b/>
+          <w:bCs/>
+        </w:rPr>
+        <w:t>Dado</w:t>
+      </w:r>
+      <w:r>
+        <w:t xml:space="preserve"> que eu realizo a busca de um </w:t>
+      </w:r>
+      <w:r>
+        <w:t>CEP válido</w:t>
+      </w:r>
+    </w:p>
+    <w:p>
+      <w:pPr>
+        <w:pStyle w:val="PargrafodaLista"/>
+      </w:pPr>
+      <w:r>
+        <w:rPr>
+          <w:b/>
+          <w:bCs/>
+        </w:rPr>
+        <w:t>Quando</w:t>
+      </w:r>
+      <w:r>
+        <w:t xml:space="preserve"> </w:t>
+      </w:r>
+      <w:r>
+        <w:t>realiz</w:t>
+      </w:r>
+      <w:r>
+        <w:t>o</w:t>
+      </w:r>
+      <w:r>
+        <w:t xml:space="preserve"> uma requisição</w:t>
+      </w:r>
+      <w:r>
+        <w:t xml:space="preserve"> (</w:t>
+      </w:r>
+      <w:r>
+        <w:t>https://cdn.apicep.com/file/</w:t>
       </w:r>
       <w:proofErr w:type="spellStart"/>
       <w:r>
-        <w:t>state</w:t>
+        <w:t>apicep</w:t>
       </w:r>
       <w:proofErr w:type="spellEnd"/>
       <w:r>
-        <w:t>":"SP",</w:t>
-      </w:r>
-    </w:p>
-    <w:p>
-      <w:pPr>
-        <w:pStyle w:val="PargrafodaLista"/>
-      </w:pPr>
-      <w:r>
-        <w:t> "</w:t>
-      </w:r>
-      <w:proofErr w:type="spellStart"/>
-      <w:r>
-        <w:t>city</w:t>
-      </w:r>
-      <w:proofErr w:type="spellEnd"/>
-      <w:r>
-        <w:t>":"Osasco",</w:t>
-      </w:r>
-    </w:p>
-    <w:p>
-      <w:pPr>
-        <w:pStyle w:val="PargrafodaLista"/>
-      </w:pPr>
-      <w:r>
-        <w:t> "</w:t>
-      </w:r>
-      <w:proofErr w:type="spellStart"/>
-      <w:r>
-        <w:t>district</w:t>
-      </w:r>
-      <w:proofErr w:type="spellEnd"/>
-      <w:r>
-        <w:t>":"Piratininga",</w:t>
-      </w:r>
-    </w:p>
-    <w:p>
-      <w:pPr>
-        <w:pStyle w:val="PargrafodaLista"/>
-      </w:pPr>
-      <w:r>
-        <w:t> "</w:t>
-      </w:r>
-      <w:proofErr w:type="spellStart"/>
-      <w:r>
-        <w:t>address</w:t>
-      </w:r>
-      <w:proofErr w:type="spellEnd"/>
-      <w:r>
-        <w:t>":"Rua Paula Rodrigues"}</w:t>
-      </w:r>
-    </w:p>
-    <w:p>
-      <w:pPr>
-        <w:pStyle w:val="PargrafodaLista"/>
-      </w:pPr>
-    </w:p>
-    <w:p>
-      <w:pPr>
-        <w:rPr>
-          <w:b/>
-          <w:bCs/>
-        </w:rPr>
-      </w:pPr>
-      <w:r>
-        <w:rPr>
-          <w:b/>
-          <w:bCs/>
-        </w:rPr>
-        <w:lastRenderedPageBreak/>
+        <w:t>/06233-030.json</w:t>
+      </w:r>
+      <w:r>
+        <w:t>)</w:t>
+      </w:r>
+    </w:p>
+    <w:p>
+      <w:pPr>
+        <w:pStyle w:val="PargrafodaLista"/>
+      </w:pPr>
+    </w:p>
+    <w:p>
+      <w:pPr>
+        <w:pStyle w:val="PargrafodaLista"/>
+      </w:pPr>
+      <w:r>
+        <w:rPr>
+          <w:noProof/>
+        </w:rPr>
         <w:drawing>
-          <wp:inline distT="0" distB="0" distL="0" distR="0" wp14:anchorId="59A503DF" wp14:editId="03D50668">
+          <wp:inline distT="0" distB="0" distL="0" distR="0" wp14:anchorId="0440ED10" wp14:editId="473F60AD">
             <wp:extent cx="5400040" cy="2817495"/>
             <wp:effectExtent l="0" t="0" r="0" b="1905"/>
-            <wp:docPr id="44578157" name="Imagem 1"/>
+            <wp:docPr id="1096123355" name="Imagem 1"/>
             <wp:cNvGraphicFramePr>
               <a:graphicFrameLocks xmlns:a="http://schemas.openxmlformats.org/drawingml/2006/main" noChangeAspect="1"/>
             </wp:cNvGraphicFramePr>
@@ -1614,7 +1478,7 @@
               <a:graphicData uri="http://schemas.openxmlformats.org/drawingml/2006/picture">
                 <pic:pic xmlns:pic="http://schemas.openxmlformats.org/drawingml/2006/picture">
                   <pic:nvPicPr>
-                    <pic:cNvPr id="44578157" name=""/>
+                    <pic:cNvPr id="1096123355" name=""/>
                     <pic:cNvPicPr/>
                   </pic:nvPicPr>
                   <pic:blipFill>
@@ -1641,6 +1505,162 @@
     </w:p>
     <w:p>
       <w:pPr>
+        <w:pStyle w:val="PargrafodaLista"/>
+      </w:pPr>
+    </w:p>
+    <w:p>
+      <w:pPr>
+        <w:pStyle w:val="PargrafodaLista"/>
+      </w:pPr>
+      <w:r>
+        <w:rPr>
+          <w:b/>
+          <w:bCs/>
+        </w:rPr>
+        <w:t xml:space="preserve">Então </w:t>
+      </w:r>
+      <w:r>
+        <w:t xml:space="preserve">o JSON de retorno deve conter obrigatoriamente os campos </w:t>
+      </w:r>
+    </w:p>
+    <w:p>
+      <w:pPr>
+        <w:pStyle w:val="PargrafodaLista"/>
+      </w:pPr>
+      <w:r>
+        <w:t>{"status":200,</w:t>
+      </w:r>
+    </w:p>
+    <w:p>
+      <w:pPr>
+        <w:pStyle w:val="PargrafodaLista"/>
+      </w:pPr>
+      <w:r>
+        <w:t> "code":"06233-030",</w:t>
+      </w:r>
+    </w:p>
+    <w:p>
+      <w:pPr>
+        <w:pStyle w:val="PargrafodaLista"/>
+      </w:pPr>
+      <w:r>
+        <w:t> "</w:t>
+      </w:r>
+      <w:proofErr w:type="spellStart"/>
+      <w:r>
+        <w:t>state</w:t>
+      </w:r>
+      <w:proofErr w:type="spellEnd"/>
+      <w:r>
+        <w:t>":"SP",</w:t>
+      </w:r>
+    </w:p>
+    <w:p>
+      <w:pPr>
+        <w:pStyle w:val="PargrafodaLista"/>
+      </w:pPr>
+      <w:r>
+        <w:t> "</w:t>
+      </w:r>
+      <w:proofErr w:type="spellStart"/>
+      <w:r>
+        <w:t>city</w:t>
+      </w:r>
+      <w:proofErr w:type="spellEnd"/>
+      <w:r>
+        <w:t>":"Osasco",</w:t>
+      </w:r>
+    </w:p>
+    <w:p>
+      <w:pPr>
+        <w:pStyle w:val="PargrafodaLista"/>
+      </w:pPr>
+      <w:r>
+        <w:t> "</w:t>
+      </w:r>
+      <w:proofErr w:type="spellStart"/>
+      <w:r>
+        <w:t>district</w:t>
+      </w:r>
+      <w:proofErr w:type="spellEnd"/>
+      <w:r>
+        <w:t>":"Piratininga",</w:t>
+      </w:r>
+    </w:p>
+    <w:p>
+      <w:pPr>
+        <w:pStyle w:val="PargrafodaLista"/>
+      </w:pPr>
+      <w:r>
+        <w:t> "</w:t>
+      </w:r>
+      <w:proofErr w:type="spellStart"/>
+      <w:r>
+        <w:t>address</w:t>
+      </w:r>
+      <w:proofErr w:type="spellEnd"/>
+      <w:r>
+        <w:t>":"Rua Paula Rodrigues"}</w:t>
+      </w:r>
+    </w:p>
+    <w:p>
+      <w:pPr>
+        <w:pStyle w:val="PargrafodaLista"/>
+      </w:pPr>
+    </w:p>
+    <w:p>
+      <w:pPr>
+        <w:rPr>
+          <w:b/>
+          <w:bCs/>
+        </w:rPr>
+      </w:pPr>
+      <w:r>
+        <w:rPr>
+          <w:b/>
+          <w:bCs/>
+          <w:noProof/>
+        </w:rPr>
+        <w:lastRenderedPageBreak/>
+        <w:drawing>
+          <wp:inline distT="0" distB="0" distL="0" distR="0" wp14:anchorId="59A503DF" wp14:editId="03D50668">
+            <wp:extent cx="5400040" cy="2817495"/>
+            <wp:effectExtent l="0" t="0" r="0" b="1905"/>
+            <wp:docPr id="44578157" name="Imagem 1"/>
+            <wp:cNvGraphicFramePr>
+              <a:graphicFrameLocks xmlns:a="http://schemas.openxmlformats.org/drawingml/2006/main" noChangeAspect="1"/>
+            </wp:cNvGraphicFramePr>
+            <a:graphic xmlns:a="http://schemas.openxmlformats.org/drawingml/2006/main">
+              <a:graphicData uri="http://schemas.openxmlformats.org/drawingml/2006/picture">
+                <pic:pic xmlns:pic="http://schemas.openxmlformats.org/drawingml/2006/picture">
+                  <pic:nvPicPr>
+                    <pic:cNvPr id="44578157" name=""/>
+                    <pic:cNvPicPr/>
+                  </pic:nvPicPr>
+                  <pic:blipFill>
+                    <a:blip r:embed="rId10"/>
+                    <a:stretch>
+                      <a:fillRect/>
+                    </a:stretch>
+                  </pic:blipFill>
+                  <pic:spPr>
+                    <a:xfrm>
+                      <a:off x="0" y="0"/>
+                      <a:ext cx="5400040" cy="2817495"/>
+                    </a:xfrm>
+                    <a:prstGeom prst="rect">
+                      <a:avLst/>
+                    </a:prstGeom>
+                  </pic:spPr>
+                </pic:pic>
+              </a:graphicData>
+            </a:graphic>
+          </wp:inline>
+        </w:drawing>
+      </w:r>
+    </w:p>
+    <w:p>
+      <w:pPr>
         <w:rPr>
           <w:b/>
           <w:bCs/>
@@ -1746,6 +1766,9 @@
         <w:pStyle w:val="PargrafodaLista"/>
       </w:pPr>
       <w:r>
+        <w:rPr>
+          <w:noProof/>
+        </w:rPr>
         <w:drawing>
           <wp:inline distT="0" distB="0" distL="0" distR="0" wp14:anchorId="2554A6E1" wp14:editId="4D6B86EC">
             <wp:extent cx="5400040" cy="1623695"/>
@@ -1762,7 +1785,7 @@
                     <pic:cNvPicPr/>
                   </pic:nvPicPr>
                   <pic:blipFill>
-                    <a:blip r:embed="rId10"/>
+                    <a:blip r:embed="rId11"/>
                     <a:stretch>
                       <a:fillRect/>
                     </a:stretch>
@@ -1846,6 +1869,9 @@
         <w:pStyle w:val="PargrafodaLista"/>
       </w:pPr>
       <w:r>
+        <w:rPr>
+          <w:noProof/>
+        </w:rPr>
         <w:drawing>
           <wp:inline distT="0" distB="0" distL="0" distR="0" wp14:anchorId="368681A8" wp14:editId="02AE51D2">
             <wp:extent cx="5400040" cy="2366645"/>
@@ -1862,7 +1888,7 @@
                     <pic:cNvPicPr/>
                   </pic:nvPicPr>
                   <pic:blipFill>
-                    <a:blip r:embed="rId11"/>
+                    <a:blip r:embed="rId12"/>
                     <a:stretch>
                       <a:fillRect/>
                     </a:stretch>
@@ -1998,6 +2024,9 @@
         <w:pStyle w:val="PargrafodaLista"/>
       </w:pPr>
       <w:r>
+        <w:rPr>
+          <w:noProof/>
+        </w:rPr>
         <w:drawing>
           <wp:inline distT="0" distB="0" distL="0" distR="0" wp14:anchorId="44DF9C72" wp14:editId="6B5AE00C">
             <wp:extent cx="5400040" cy="2141220"/>
@@ -2014,7 +2043,7 @@
                     <pic:cNvPicPr/>
                   </pic:nvPicPr>
                   <pic:blipFill>
-                    <a:blip r:embed="rId12"/>
+                    <a:blip r:embed="rId13"/>
                     <a:stretch>
                       <a:fillRect/>
                     </a:stretch>
@@ -2100,6 +2129,7 @@
         <w:rPr>
           <w:b/>
           <w:bCs/>
+          <w:noProof/>
         </w:rPr>
         <w:drawing>
           <wp:inline distT="0" distB="0" distL="0" distR="0" wp14:anchorId="3630C246" wp14:editId="0D0D6D27">
@@ -2117,7 +2147,7 @@
                     <pic:cNvPicPr/>
                   </pic:nvPicPr>
                   <pic:blipFill>
-                    <a:blip r:embed="rId13"/>
+                    <a:blip r:embed="rId14"/>
                     <a:stretch>
                       <a:fillRect/>
                     </a:stretch>
@@ -2246,6 +2276,9 @@
         <w:pStyle w:val="PargrafodaLista"/>
       </w:pPr>
       <w:r>
+        <w:rPr>
+          <w:noProof/>
+        </w:rPr>
         <w:lastRenderedPageBreak/>
         <w:drawing>
           <wp:inline distT="0" distB="0" distL="0" distR="0" wp14:anchorId="0EE1609E" wp14:editId="2427B409">
@@ -2263,7 +2296,7 @@
                     <pic:cNvPicPr/>
                   </pic:nvPicPr>
                   <pic:blipFill>
-                    <a:blip r:embed="rId14"/>
+                    <a:blip r:embed="rId15"/>
                     <a:stretch>
                       <a:fillRect/>
                     </a:stretch>
@@ -2345,6 +2378,7 @@
         <w:rPr>
           <w:b/>
           <w:bCs/>
+          <w:noProof/>
         </w:rPr>
         <w:drawing>
           <wp:inline distT="0" distB="0" distL="0" distR="0" wp14:anchorId="0DA6AB44" wp14:editId="6EDD79B3">
@@ -2362,7 +2396,7 @@
                     <pic:cNvPicPr/>
                   </pic:nvPicPr>
                   <pic:blipFill>
-                    <a:blip r:embed="rId15"/>
+                    <a:blip r:embed="rId16"/>
                     <a:stretch>
                       <a:fillRect/>
                     </a:stretch>
@@ -3479,6 +3513,7 @@
   <w:style w:type="character" w:default="1" w:styleId="Fontepargpadro">
     <w:name w:val="Default Paragraph Font"/>
     <w:uiPriority w:val="1"/>
+    <w:semiHidden/>
     <w:unhideWhenUsed/>
   </w:style>
   <w:style w:type="table" w:default="1" w:styleId="Tabelanormal">

</xml_diff>